<commit_message>
feat: integrate Cloudinary image management, Gemini AI assistant, and secure VNPay/MoMo payments
- Chuyển đổi và quản lý hình ảnh sản phẩm & danh mục sang Cloudinary với middleware upload tự động
- Tích hợp trợ lý AI Gemini tư vấn sản phẩm, size giày, tra cứu chính sách và đơn hàng với cơ chế dự phòng đa model
- Tích hợp và bảo mật cổng thanh toán VNPay & MoMo Sandbox với xác thực chữ ký số HMAC-SHA512
- Tự động chuyển trạng thái đơn hàng sang 'Đang chuẩn bị' khi thanh toán online thành công
- Sắp xếp và tối ưu hiển thị danh sách đơn hàng Admin theo thời gian mới nhất
- Khắc phục các lỗi tính giá giỏ hàng, đồng bộ tồn kho và phân trang
</commit_message>
<xml_diff>
--- a/Bao_cao_SneakerHub.docx
+++ b/Bao_cao_SneakerHub.docx
@@ -22,7 +22,7 @@
           <w:szCs w:val="32"/>
         </w:rPr>
         <w:drawing>
-          <wp:anchor distT="0" distB="0" distL="114300" distR="114300" simplePos="0" relativeHeight="251658240" behindDoc="0" locked="0" layoutInCell="1" allowOverlap="1" wp14:anchorId="18D44E27" wp14:editId="23C6F43A">
+          <wp:anchor distT="0" distB="0" distL="114300" distR="114300" simplePos="0" relativeHeight="251658240" behindDoc="0" locked="0" layoutInCell="1" allowOverlap="1" wp14:anchorId="0B58BC28" wp14:editId="66370619">
             <wp:simplePos x="0" y="0"/>
             <wp:positionH relativeFrom="column">
               <wp:posOffset>53340</wp:posOffset>
@@ -918,7 +918,7 @@
           <w:szCs w:val="28"/>
         </w:rPr>
         <w:drawing>
-          <wp:inline distT="0" distB="0" distL="0" distR="0" wp14:anchorId="2294288B" wp14:editId="28E41D50">
+          <wp:inline distT="0" distB="0" distL="0" distR="0" wp14:anchorId="67F1D66E" wp14:editId="43BC22A3">
             <wp:extent cx="1257300" cy="735401"/>
             <wp:effectExtent l="0" t="0" r="0" b="7620"/>
             <wp:docPr id="18" name="Picture 18"/>
@@ -5483,22 +5483,13 @@
         </w:rPr>
       </w:pPr>
       <w:r>
-        <w:rPr>
-          <w:rFonts w:ascii="Times New Roman" w:hAnsi="Times New Roman"/>
-        </w:rPr>
         <w:t>4.3.9.2</w:t>
       </w:r>
       <w:r>
-        <w:rPr>
-          <w:rFonts w:ascii="Times New Roman" w:hAnsi="Times New Roman"/>
-        </w:rPr>
         <w:tab/>
         <w:t>Kênh chat HTTP Short Polling</w:t>
       </w:r>
       <w:r>
-        <w:rPr>
-          <w:rFonts w:ascii="Times New Roman" w:hAnsi="Times New Roman"/>
-        </w:rPr>
         <w:tab/>
         <w:t>26</w:t>
       </w:r>
@@ -9900,15 +9891,9 @@
         </w:rPr>
       </w:pPr>
       <w:r>
-        <w:rPr>
-          <w:rFonts w:ascii="Times New Roman" w:hAnsi="Times New Roman"/>
-        </w:rPr>
         <w:t>Hình 4.11 Biểu đồ giao tiếp kênh chat HTTP Short Polling</w:t>
       </w:r>
       <w:r>
-        <w:rPr>
-          <w:rFonts w:ascii="Times New Roman" w:hAnsi="Times New Roman"/>
-        </w:rPr>
         <w:tab/>
         <w:t>26</w:t>
       </w:r>
@@ -10952,9 +10937,6 @@
         </w:rPr>
       </w:pPr>
       <w:r>
-        <w:rPr>
-          <w:rFonts w:ascii="Times New Roman" w:hAnsi="Times New Roman"/>
-        </w:rPr>
         <w:t>Để đáp ứng yêu cầu của hệ thống, đề tài sử dụng ReactJS để xây dựng giao diện người dùng, Node.js và Express.js để phát triển hệ thống phía máy chủ, MongoDB để quản lý dữ liệu và cơ chế HTTP Short Polling để hỗ trợ trao đổi dữ liệu tin nhắn thời gian thực giữa khách hàng và nhân viên. Ngoài ra, hệ thống còn ứng dụng Gemini API kết hợp cơ chế Function Calling nhằm xây dựng chatbot AI có khả năng tư vấn kích cỡ sản phẩm, hỗ trợ tìm kiếm thông tin và giải đáp các câu hỏi của khách hàng. Về bảo mật, hệ thống áp dụng cơ chế xác thực bằng JSON Web Token (JWT) kết hợp phân quyền theo vai trò nhằm bảo đảm an toàn dữ liệu và kiểm soát quyền truy cập của từng nhóm người dùng.</w:t>
       </w:r>
     </w:p>
@@ -11823,7 +11805,7 @@
           <w:noProof/>
         </w:rPr>
         <w:drawing>
-          <wp:inline distT="0" distB="0" distL="0" distR="0" wp14:anchorId="52453E1C" wp14:editId="456C8CEA">
+          <wp:inline distT="0" distB="0" distL="0" distR="0" wp14:anchorId="2389978A" wp14:editId="7087582E">
             <wp:extent cx="5760720" cy="2297430"/>
             <wp:effectExtent l="0" t="0" r="0" b="7620"/>
             <wp:docPr id="2" name="Picture 2" descr="PlantUML Diagram"/>
@@ -11906,9 +11888,6 @@
         </w:rPr>
       </w:pPr>
       <w:r>
-        <w:rPr>
-          <w:rFonts w:ascii="Times New Roman" w:hAnsi="Times New Roman"/>
-        </w:rPr>
         <w:t>Frontend Client Layer : Giao diện SPA viết bằng ReactJS chịu trách nhiệm kết xuất đồ họa (rendering), lưu trữ trạng thái cục bộ của giao diện, gửi các yêu cầu HTTP bằng Axios và thực hiện cơ chế HTTP Short Polling để truy xuất tin nhắn mới định kỳ.</w:t>
       </w:r>
     </w:p>
@@ -12113,6 +12092,7 @@
         <w:rPr>
           <w:lang w:val="vi-VN"/>
         </w:rPr>
+        <w:lastRenderedPageBreak/>
         <w:t>PUT: dùng để cập nhật dữ liệu.</w:t>
       </w:r>
     </w:p>
@@ -12133,7 +12113,6 @@
         <w:rPr>
           <w:lang w:val="vi-VN"/>
         </w:rPr>
-        <w:lastRenderedPageBreak/>
         <w:t>DELETE: dùng để xóa dữ liệu.</w:t>
       </w:r>
     </w:p>
@@ -12456,9 +12435,6 @@
         </w:rPr>
       </w:pPr>
       <w:r>
-        <w:rPr>
-          <w:rFonts w:ascii="Times New Roman" w:hAnsi="Times New Roman"/>
-        </w:rPr>
         <w:t>HTTP Short Polling là kỹ thuật giao tiếp trong đó Client định kỳ gửi các yêu cầu HTTP GET đến Server sau một khoảng thời gian nhất định (khoảng 2-3 giây) để tự động kiểm tra và cập nhật các tin nhắn mới từ cơ sở dữ liệu.</w:t>
       </w:r>
     </w:p>
@@ -12495,6 +12471,7 @@
         </w:rPr>
       </w:pPr>
       <w:r>
+        <w:lastRenderedPageBreak/>
         <w:t>Session Filtering: Cơ chế lọc cuộc hội thoại dựa trên Session ID của từng khách hàng, giúp gom tin nhắn giữa khách hàng và nhân viên hỗ trợ vào phiên trò chuyện riêng biệt, bảo mật và không bị lộ ra ngoài.</w:t>
       </w:r>
     </w:p>
@@ -12848,9 +12825,6 @@
         </w:rPr>
       </w:pPr>
       <w:r>
-        <w:rPr>
-          <w:rFonts w:ascii="Times New Roman" w:hAnsi="Times New Roman"/>
-        </w:rPr>
         <w:t>JSON là định dạng truyền tải dữ liệu chuẩn hóa xuyên suốt hệ thống SneakerHub: từ dữ liệu trao đổi qua REST API, tin nhắn HTTP Polling thời gian thực, cấu hình các Tool của Gemini AI, cho đến dữ liệu cột thuộc kiểu `JSON` trong bảng `reviews` và `complaints`.</w:t>
       </w:r>
     </w:p>
@@ -19543,7 +19517,7 @@
           <w:noProof/>
         </w:rPr>
         <w:drawing>
-          <wp:inline distT="0" distB="0" distL="0" distR="0" wp14:anchorId="7066D78E" wp14:editId="346847AA">
+          <wp:inline distT="0" distB="0" distL="0" distR="0" wp14:anchorId="134ECEC1" wp14:editId="515E8745">
             <wp:extent cx="5760720" cy="7011035"/>
             <wp:effectExtent l="0" t="0" r="0" b="0"/>
             <wp:docPr id="3" name="Picture 3"/>
@@ -22023,7 +21997,7 @@
           <w:noProof/>
         </w:rPr>
         <w:drawing>
-          <wp:inline distT="0" distB="0" distL="0" distR="0" wp14:anchorId="1F921FF3" wp14:editId="43E062ED">
+          <wp:inline distT="0" distB="0" distL="0" distR="0" wp14:anchorId="32785502" wp14:editId="4D61F9A1">
             <wp:extent cx="5760720" cy="5346065"/>
             <wp:effectExtent l="0" t="0" r="0" b="6985"/>
             <wp:docPr id="5" name="Picture 5"/>
@@ -22195,7 +22169,7 @@
           <w:noProof/>
         </w:rPr>
         <w:drawing>
-          <wp:inline distT="0" distB="0" distL="0" distR="0" wp14:anchorId="123FFA0A" wp14:editId="3B68003D">
+          <wp:inline distT="0" distB="0" distL="0" distR="0" wp14:anchorId="42B26F67" wp14:editId="52689B0F">
             <wp:extent cx="5486400" cy="6012815"/>
             <wp:effectExtent l="0" t="0" r="0" b="6985"/>
             <wp:docPr id="7" name="Picture 7"/>
@@ -22362,7 +22336,7 @@
           <w:noProof/>
         </w:rPr>
         <w:drawing>
-          <wp:inline distT="0" distB="0" distL="0" distR="0" wp14:anchorId="1FDDFD41" wp14:editId="224958F8">
+          <wp:inline distT="0" distB="0" distL="0" distR="0" wp14:anchorId="121163B9" wp14:editId="402B5872">
             <wp:extent cx="5760720" cy="1633220"/>
             <wp:effectExtent l="0" t="0" r="0" b="5080"/>
             <wp:docPr id="8" name="Picture 8"/>
@@ -22547,7 +22521,7 @@
           <w:noProof/>
         </w:rPr>
         <w:drawing>
-          <wp:inline distT="0" distB="0" distL="0" distR="0" wp14:anchorId="72E6D7F7" wp14:editId="1CF80F93">
+          <wp:inline distT="0" distB="0" distL="0" distR="0" wp14:anchorId="59ECD5A5" wp14:editId="6DCCF8AD">
             <wp:extent cx="5760720" cy="2840990"/>
             <wp:effectExtent l="0" t="0" r="0" b="0"/>
             <wp:docPr id="9" name="Picture 9"/>
@@ -22715,7 +22689,7 @@
           <w:noProof/>
         </w:rPr>
         <w:drawing>
-          <wp:inline distT="0" distB="0" distL="0" distR="0" wp14:anchorId="737A4328" wp14:editId="346F3DAF">
+          <wp:inline distT="0" distB="0" distL="0" distR="0" wp14:anchorId="6B6CE79A" wp14:editId="4BFDE85E">
             <wp:extent cx="5760720" cy="1582420"/>
             <wp:effectExtent l="0" t="0" r="0" b="0"/>
             <wp:docPr id="10" name="Picture 10"/>
@@ -22884,7 +22858,7 @@
           <w:noProof/>
         </w:rPr>
         <w:drawing>
-          <wp:inline distT="0" distB="0" distL="0" distR="0" wp14:anchorId="2A9E28A2" wp14:editId="1089A253">
+          <wp:inline distT="0" distB="0" distL="0" distR="0" wp14:anchorId="66C84DDD" wp14:editId="2D6010D2">
             <wp:extent cx="5760720" cy="3218815"/>
             <wp:effectExtent l="0" t="0" r="0" b="635"/>
             <wp:docPr id="11" name="Picture 11"/>
@@ -23066,7 +23040,7 @@
           <w:noProof/>
         </w:rPr>
         <w:drawing>
-          <wp:inline distT="0" distB="0" distL="0" distR="0" wp14:anchorId="0B250AF8" wp14:editId="27228424">
+          <wp:inline distT="0" distB="0" distL="0" distR="0" wp14:anchorId="59721397" wp14:editId="086676C1">
             <wp:extent cx="5760720" cy="3716655"/>
             <wp:effectExtent l="0" t="0" r="0" b="0"/>
             <wp:docPr id="12" name="Picture 12"/>
@@ -23233,7 +23207,7 @@
           <w:noProof/>
         </w:rPr>
         <w:drawing>
-          <wp:inline distT="0" distB="0" distL="0" distR="0" wp14:anchorId="72342DD2" wp14:editId="56CEBBD6">
+          <wp:inline distT="0" distB="0" distL="0" distR="0" wp14:anchorId="5DE676FE" wp14:editId="6D6FE6E8">
             <wp:extent cx="5760720" cy="3626485"/>
             <wp:effectExtent l="0" t="0" r="0" b="0"/>
             <wp:docPr id="13" name="Picture 13"/>
@@ -23415,7 +23389,7 @@
           <w:noProof/>
         </w:rPr>
         <w:drawing>
-          <wp:inline distT="0" distB="0" distL="0" distR="0" wp14:anchorId="5408E5F8" wp14:editId="746B4424">
+          <wp:inline distT="0" distB="0" distL="0" distR="0" wp14:anchorId="78FA3D0D" wp14:editId="330515C8">
             <wp:extent cx="5760720" cy="3989705"/>
             <wp:effectExtent l="0" t="0" r="0" b="0"/>
             <wp:docPr id="16" name="Picture 16"/>
@@ -23472,9 +23446,7 @@
         </w:rPr>
       </w:pPr>
       <w:r>
-        <w:rPr>
-          <w:rFonts w:ascii="Times New Roman" w:hAnsi="Times New Roman"/>
-        </w:rPr>
+        <w:lastRenderedPageBreak/>
         <w:t>Kênh chat HTTP Short Polling</w:t>
       </w:r>
     </w:p>
@@ -23490,7 +23462,6 @@
       </w:pPr>
       <w:r>
         <w:rPr>
-          <w:rFonts w:ascii="Times New Roman" w:hAnsi="Times New Roman"/>
           <w:b/>
           <w:bCs/>
           <w:color w:val="000000" w:themeColor="text1"/>
@@ -23511,7 +23482,7 @@
           <w:noProof/>
         </w:rPr>
         <w:drawing>
-          <wp:inline distT="0" distB="0" distL="0" distR="0" wp14:anchorId="52220C3E" wp14:editId="7F3C8767">
+          <wp:inline distT="0" distB="0" distL="0" distR="0" wp14:anchorId="65216F72" wp14:editId="4EBD67CB">
             <wp:extent cx="5760720" cy="5131435"/>
             <wp:effectExtent l="0" t="0" r="0" b="0"/>
             <wp:docPr id="17" name="Picture 17"/>
@@ -23567,16 +23538,16 @@
           <w:lang w:val="vi-VN"/>
         </w:rPr>
       </w:pPr>
-      <w:bookmarkStart w:id="121" w:name="_Toc235631447"/>
-      <w:bookmarkStart w:id="122" w:name="_Toc235739076"/>
+      <w:bookmarkStart w:id="120" w:name="_Toc235631447"/>
+      <w:bookmarkStart w:id="121" w:name="_Toc235739076"/>
       <w:r>
         <w:rPr>
           <w:lang w:val="vi-VN"/>
         </w:rPr>
         <w:t>Thiết kế kiến trúc hệ thống</w:t>
       </w:r>
+      <w:bookmarkEnd w:id="120"/>
       <w:bookmarkEnd w:id="121"/>
-      <w:bookmarkEnd w:id="122"/>
     </w:p>
     <w:p>
       <w:pPr>
@@ -23707,7 +23678,7 @@
           <w:lang w:val="vi-VN"/>
         </w:rPr>
       </w:pPr>
-      <w:bookmarkStart w:id="123" w:name="_Toc235739110"/>
+      <w:bookmarkStart w:id="122" w:name="_Toc235739110"/>
       <w:r>
         <w:rPr>
           <w:lang w:val="vi-VN"/>
@@ -23788,7 +23759,7 @@
         </w:rPr>
         <w:t xml:space="preserve"> Kiến trúc hệ thống</w:t>
       </w:r>
-      <w:bookmarkEnd w:id="123"/>
+      <w:bookmarkEnd w:id="122"/>
     </w:p>
     <w:p>
       <w:pPr>
@@ -23799,7 +23770,7 @@
           <w:noProof/>
         </w:rPr>
         <w:drawing>
-          <wp:inline distT="0" distB="0" distL="0" distR="0" wp14:anchorId="5023754D" wp14:editId="7B57E09D">
+          <wp:inline distT="0" distB="0" distL="0" distR="0" wp14:anchorId="5343A87E" wp14:editId="65A3CA21">
             <wp:extent cx="5760720" cy="1792605"/>
             <wp:effectExtent l="0" t="0" r="0" b="0"/>
             <wp:docPr id="20" name="Picture 20"/>
@@ -23855,8 +23826,8 @@
           <w:lang w:val="vi-VN"/>
         </w:rPr>
       </w:pPr>
-      <w:bookmarkStart w:id="124" w:name="_Toc235631448"/>
-      <w:bookmarkStart w:id="125" w:name="_Toc235739077"/>
+      <w:bookmarkStart w:id="123" w:name="_Toc235631448"/>
+      <w:bookmarkStart w:id="124" w:name="_Toc235739077"/>
       <w:r>
         <w:rPr>
           <w:lang w:val="vi-VN"/>
@@ -23869,29 +23840,29 @@
         </w:rPr>
         <w:t>iểu đồ lớp</w:t>
       </w:r>
+      <w:bookmarkEnd w:id="123"/>
       <w:bookmarkEnd w:id="124"/>
+      <w:r>
+        <w:rPr>
+          <w:lang w:val="vi-VN"/>
+        </w:rPr>
+        <w:t xml:space="preserve"> </w:t>
+      </w:r>
+    </w:p>
+    <w:p>
+      <w:pPr>
+        <w:pStyle w:val="Heading4"/>
+      </w:pPr>
+      <w:bookmarkStart w:id="125" w:name="_Toc235631449"/>
+      <w:bookmarkStart w:id="126" w:name="_Toc235739078"/>
+      <w:r>
+        <w:rPr>
+          <w:lang w:val="vi-VN"/>
+        </w:rPr>
+        <w:t>Biểu đồ lớp tổng quát</w:t>
+      </w:r>
       <w:bookmarkEnd w:id="125"/>
-      <w:r>
-        <w:rPr>
-          <w:lang w:val="vi-VN"/>
-        </w:rPr>
-        <w:t xml:space="preserve"> </w:t>
-      </w:r>
-    </w:p>
-    <w:p>
-      <w:pPr>
-        <w:pStyle w:val="Heading4"/>
-      </w:pPr>
-      <w:bookmarkStart w:id="126" w:name="_Toc235631449"/>
-      <w:bookmarkStart w:id="127" w:name="_Toc235739078"/>
-      <w:r>
-        <w:rPr>
-          <w:lang w:val="vi-VN"/>
-        </w:rPr>
-        <w:t>Biểu đồ lớp tổng quát</w:t>
-      </w:r>
       <w:bookmarkEnd w:id="126"/>
-      <w:bookmarkEnd w:id="127"/>
     </w:p>
     <w:p/>
     <w:p>
@@ -23901,7 +23872,7 @@
           <w:lang w:val="vi-VN"/>
         </w:rPr>
       </w:pPr>
-      <w:bookmarkStart w:id="128" w:name="_Toc235739111"/>
+      <w:bookmarkStart w:id="127" w:name="_Toc235739111"/>
       <w:r>
         <w:rPr>
           <w:lang w:val="vi-VN"/>
@@ -23983,7 +23954,7 @@
         </w:rPr>
         <w:t xml:space="preserve"> Biểu đồ lớp tổng quát</w:t>
       </w:r>
-      <w:bookmarkEnd w:id="128"/>
+      <w:bookmarkEnd w:id="127"/>
     </w:p>
     <w:p>
       <w:pPr>
@@ -23997,7 +23968,7 @@
           <w:noProof/>
         </w:rPr>
         <w:drawing>
-          <wp:inline distT="0" distB="0" distL="0" distR="0" wp14:anchorId="7550D879" wp14:editId="398D9A76">
+          <wp:inline distT="0" distB="0" distL="0" distR="0" wp14:anchorId="578E4474" wp14:editId="07E508A3">
             <wp:extent cx="5760720" cy="7914005"/>
             <wp:effectExtent l="0" t="0" r="0" b="0"/>
             <wp:docPr id="21" name="Picture 21" descr="PlantUML Diagram"/>
@@ -24053,38 +24024,38 @@
           <w:lang w:val="vi-VN"/>
         </w:rPr>
       </w:pPr>
-      <w:bookmarkStart w:id="129" w:name="_Toc235631451"/>
-      <w:bookmarkStart w:id="130" w:name="_Toc235739079"/>
+      <w:bookmarkStart w:id="128" w:name="_Toc235631451"/>
+      <w:bookmarkStart w:id="129" w:name="_Toc235739079"/>
       <w:r>
         <w:rPr>
           <w:lang w:val="vi-VN"/>
         </w:rPr>
         <w:t>Thiết kế cơ sở dữ liệu</w:t>
       </w:r>
+      <w:bookmarkEnd w:id="128"/>
       <w:bookmarkEnd w:id="129"/>
+    </w:p>
+    <w:p>
+      <w:pPr>
+        <w:pStyle w:val="Heading4"/>
+        <w:rPr>
+          <w:lang w:val="vi-VN"/>
+        </w:rPr>
+      </w:pPr>
+      <w:bookmarkStart w:id="130" w:name="_Toc235739080"/>
+      <w:r>
+        <w:rPr>
+          <w:lang w:val="vi-VN"/>
+        </w:rPr>
+        <w:t>Mô hình ERD</w:t>
+      </w:r>
       <w:bookmarkEnd w:id="130"/>
     </w:p>
     <w:p>
       <w:pPr>
-        <w:pStyle w:val="Heading4"/>
-        <w:rPr>
-          <w:lang w:val="vi-VN"/>
-        </w:rPr>
-      </w:pPr>
-      <w:bookmarkStart w:id="131" w:name="_Toc235739080"/>
-      <w:r>
-        <w:rPr>
-          <w:lang w:val="vi-VN"/>
-        </w:rPr>
-        <w:t>Mô hình ERD</w:t>
-      </w:r>
-      <w:bookmarkEnd w:id="131"/>
-    </w:p>
-    <w:p>
-      <w:pPr>
         <w:pStyle w:val="Caption"/>
       </w:pPr>
-      <w:bookmarkStart w:id="132" w:name="_Toc235739112"/>
+      <w:bookmarkStart w:id="131" w:name="_Toc235739112"/>
     </w:p>
     <w:p>
       <w:pPr>
@@ -24145,7 +24116,7 @@
         </w:rPr>
         <w:t xml:space="preserve"> Mô hình ERD</w:t>
       </w:r>
-      <w:bookmarkEnd w:id="132"/>
+      <w:bookmarkEnd w:id="131"/>
     </w:p>
     <w:p>
       <w:r>
@@ -24153,7 +24124,7 @@
           <w:noProof/>
         </w:rPr>
         <w:drawing>
-          <wp:inline distT="0" distB="0" distL="0" distR="0" wp14:anchorId="086B6821" wp14:editId="1B866380">
+          <wp:inline distT="0" distB="0" distL="0" distR="0" wp14:anchorId="7888F74E" wp14:editId="39845DFA">
             <wp:extent cx="5760720" cy="5178056"/>
             <wp:effectExtent l="0" t="0" r="0" b="3810"/>
             <wp:docPr id="22" name="Picture 22" descr="PlantUML Diagram"/>
@@ -24220,7 +24191,7 @@
           <w:lang w:val="vi-VN"/>
         </w:rPr>
       </w:pPr>
-      <w:bookmarkStart w:id="133" w:name="_Toc235631452"/>
+      <w:bookmarkStart w:id="132" w:name="_Toc235631452"/>
       <w:r>
         <w:rPr>
           <w:lang w:val="vi-VN"/>
@@ -24228,15 +24199,15 @@
         <w:lastRenderedPageBreak/>
         <w:t xml:space="preserve"> </w:t>
       </w:r>
-      <w:bookmarkStart w:id="134" w:name="_Toc235739081"/>
+      <w:bookmarkStart w:id="133" w:name="_Toc235739081"/>
       <w:r>
         <w:rPr>
           <w:lang w:val="vi-VN"/>
         </w:rPr>
         <w:t>Xác định các thực thể</w:t>
       </w:r>
+      <w:bookmarkEnd w:id="132"/>
       <w:bookmarkEnd w:id="133"/>
-      <w:bookmarkEnd w:id="134"/>
     </w:p>
     <w:tbl>
       <w:tblPr>
@@ -25255,16 +25226,16 @@
           <w:lang w:val="vi-VN"/>
         </w:rPr>
       </w:pPr>
-      <w:bookmarkStart w:id="135" w:name="_Toc235631454"/>
-      <w:bookmarkStart w:id="136" w:name="_Toc235739082"/>
+      <w:bookmarkStart w:id="134" w:name="_Toc235631454"/>
+      <w:bookmarkStart w:id="135" w:name="_Toc235739082"/>
       <w:r>
         <w:rPr>
           <w:lang w:val="vi-VN"/>
         </w:rPr>
         <w:t>Mô tả các bảng dữ liệu</w:t>
       </w:r>
+      <w:bookmarkEnd w:id="134"/>
       <w:bookmarkEnd w:id="135"/>
-      <w:bookmarkEnd w:id="136"/>
     </w:p>
     <w:p>
       <w:pPr>
@@ -35570,8 +35541,8 @@
         </w:rPr>
         <w:t xml:space="preserve"> </w:t>
       </w:r>
-      <w:bookmarkStart w:id="137" w:name="_Toc235631455"/>
-      <w:bookmarkStart w:id="138" w:name="_Toc235739083"/>
+      <w:bookmarkStart w:id="136" w:name="_Toc235631455"/>
+      <w:bookmarkStart w:id="137" w:name="_Toc235739083"/>
       <w:r>
         <w:rPr>
           <w:i w:val="0"/>
@@ -35580,19 +35551,19 @@
         </w:rPr>
         <w:t>Thiết kế API hệ thống</w:t>
       </w:r>
+      <w:bookmarkEnd w:id="136"/>
       <w:bookmarkEnd w:id="137"/>
-      <w:bookmarkEnd w:id="138"/>
     </w:p>
     <w:p>
       <w:pPr>
         <w:pStyle w:val="c1"/>
         <w:ind w:left="0" w:hanging="270"/>
       </w:pPr>
-      <w:bookmarkStart w:id="139" w:name="_Toc235631456"/>
+      <w:bookmarkStart w:id="138" w:name="_Toc235631456"/>
       <w:r>
         <w:t>API xác thực</w:t>
       </w:r>
-      <w:bookmarkEnd w:id="139"/>
+      <w:bookmarkEnd w:id="138"/>
     </w:p>
     <w:tbl>
       <w:tblPr>
@@ -35866,11 +35837,11 @@
         <w:pStyle w:val="c1"/>
         <w:ind w:left="0" w:hanging="270"/>
       </w:pPr>
-      <w:bookmarkStart w:id="140" w:name="_Toc235631457"/>
+      <w:bookmarkStart w:id="139" w:name="_Toc235631457"/>
       <w:r>
         <w:t>API sản phẩm</w:t>
       </w:r>
-      <w:bookmarkEnd w:id="140"/>
+      <w:bookmarkEnd w:id="139"/>
     </w:p>
     <w:tbl>
       <w:tblPr>
@@ -36191,11 +36162,11 @@
         <w:pStyle w:val="c1"/>
         <w:ind w:left="0" w:hanging="270"/>
       </w:pPr>
-      <w:bookmarkStart w:id="141" w:name="_Toc235631458"/>
+      <w:bookmarkStart w:id="140" w:name="_Toc235631458"/>
       <w:r>
         <w:t>API danh mục</w:t>
       </w:r>
-      <w:bookmarkEnd w:id="141"/>
+      <w:bookmarkEnd w:id="140"/>
     </w:p>
     <w:tbl>
       <w:tblPr>
@@ -36470,11 +36441,11 @@
         <w:pStyle w:val="c1"/>
         <w:ind w:left="0" w:hanging="270"/>
       </w:pPr>
-      <w:bookmarkStart w:id="142" w:name="_Toc235631459"/>
+      <w:bookmarkStart w:id="141" w:name="_Toc235631459"/>
       <w:r>
         <w:t>API giỏ hàng</w:t>
       </w:r>
-      <w:bookmarkEnd w:id="142"/>
+      <w:bookmarkEnd w:id="141"/>
     </w:p>
     <w:tbl>
       <w:tblPr>
@@ -36748,11 +36719,11 @@
         <w:pStyle w:val="c1"/>
         <w:ind w:left="0" w:hanging="270"/>
       </w:pPr>
-      <w:bookmarkStart w:id="143" w:name="_Toc235631460"/>
+      <w:bookmarkStart w:id="142" w:name="_Toc235631460"/>
       <w:r>
         <w:t>API đơn hàng</w:t>
       </w:r>
-      <w:bookmarkEnd w:id="143"/>
+      <w:bookmarkEnd w:id="142"/>
     </w:p>
     <w:tbl>
       <w:tblPr>
@@ -37026,11 +36997,11 @@
         <w:pStyle w:val="c1"/>
         <w:ind w:left="0" w:hanging="270"/>
       </w:pPr>
-      <w:bookmarkStart w:id="144" w:name="_Toc235631461"/>
+      <w:bookmarkStart w:id="143" w:name="_Toc235631461"/>
       <w:r>
         <w:t>API chat</w:t>
       </w:r>
-      <w:bookmarkEnd w:id="144"/>
+      <w:bookmarkEnd w:id="143"/>
     </w:p>
     <w:tbl>
       <w:tblPr>
@@ -37304,11 +37275,11 @@
         <w:pStyle w:val="c1"/>
         <w:ind w:left="90" w:hanging="360"/>
       </w:pPr>
-      <w:bookmarkStart w:id="145" w:name="_Toc235631462"/>
+      <w:bookmarkStart w:id="144" w:name="_Toc235631462"/>
       <w:r>
         <w:t>API chatbot</w:t>
       </w:r>
-      <w:bookmarkEnd w:id="145"/>
+      <w:bookmarkEnd w:id="144"/>
     </w:p>
     <w:tbl>
       <w:tblPr>
@@ -37582,11 +37553,11 @@
         <w:pStyle w:val="c1"/>
         <w:ind w:left="90" w:hanging="360"/>
       </w:pPr>
-      <w:bookmarkStart w:id="146" w:name="_Toc235631463"/>
+      <w:bookmarkStart w:id="145" w:name="_Toc235631463"/>
       <w:r>
         <w:t>API thống kê</w:t>
       </w:r>
-      <w:bookmarkEnd w:id="146"/>
+      <w:bookmarkEnd w:id="145"/>
     </w:p>
     <w:tbl>
       <w:tblPr>
@@ -37815,16 +37786,16 @@
           <w:rFonts w:cstheme="majorHAnsi"/>
         </w:rPr>
       </w:pPr>
-      <w:bookmarkStart w:id="147" w:name="_Toc215604361"/>
-      <w:bookmarkStart w:id="148" w:name="_Toc235739084"/>
+      <w:bookmarkStart w:id="146" w:name="_Toc215604361"/>
+      <w:bookmarkStart w:id="147" w:name="_Toc235739084"/>
       <w:r>
         <w:rPr>
           <w:rFonts w:cstheme="majorHAnsi"/>
         </w:rPr>
         <w:t>TRIỂN KHAI XÂY DỰNG ỨNG DỤNG</w:t>
       </w:r>
+      <w:bookmarkEnd w:id="146"/>
       <w:bookmarkEnd w:id="147"/>
-      <w:bookmarkEnd w:id="148"/>
     </w:p>
     <w:p>
       <w:pPr>
@@ -37834,13 +37805,13 @@
           <w:lang w:val="vi-VN"/>
         </w:rPr>
       </w:pPr>
-      <w:bookmarkStart w:id="149" w:name="_Toc215604362"/>
-      <w:bookmarkStart w:id="150" w:name="_Toc235739085"/>
+      <w:bookmarkStart w:id="148" w:name="_Toc215604362"/>
+      <w:bookmarkStart w:id="149" w:name="_Toc235739085"/>
       <w:r>
         <w:t>Giao diện Người dùng</w:t>
       </w:r>
+      <w:bookmarkEnd w:id="148"/>
       <w:bookmarkEnd w:id="149"/>
-      <w:bookmarkEnd w:id="150"/>
     </w:p>
     <w:p>
       <w:pPr>
@@ -37861,7 +37832,7 @@
       <w:pPr>
         <w:pStyle w:val="Caption"/>
       </w:pPr>
-      <w:bookmarkStart w:id="151" w:name="_Toc235739113"/>
+      <w:bookmarkStart w:id="150" w:name="_Toc235739113"/>
       <w:r>
         <w:t xml:space="preserve">Hình </w:t>
       </w:r>
@@ -37913,7 +37884,7 @@
       <w:r>
         <w:t xml:space="preserve"> Giao diện trang chủ</w:t>
       </w:r>
-      <w:bookmarkEnd w:id="151"/>
+      <w:bookmarkEnd w:id="150"/>
     </w:p>
     <w:p>
       <w:pPr>
@@ -37931,7 +37902,7 @@
         </w:rPr>
         <w:lastRenderedPageBreak/>
         <w:drawing>
-          <wp:inline distT="0" distB="0" distL="0" distR="0" wp14:anchorId="0DA3F11B" wp14:editId="656556D9">
+          <wp:inline distT="0" distB="0" distL="0" distR="0" wp14:anchorId="2616165D" wp14:editId="3864BFC2">
             <wp:extent cx="5760720" cy="2816860"/>
             <wp:effectExtent l="0" t="0" r="0" b="2540"/>
             <wp:docPr id="23" name="Picture 23"/>
@@ -37976,7 +37947,7 @@
           <w:noProof/>
         </w:rPr>
         <w:drawing>
-          <wp:inline distT="0" distB="0" distL="0" distR="0" wp14:anchorId="7BC1ABF4" wp14:editId="4FEEA9C6">
+          <wp:inline distT="0" distB="0" distL="0" distR="0" wp14:anchorId="0C1D4461" wp14:editId="59D4FAFA">
             <wp:extent cx="5760720" cy="2827655"/>
             <wp:effectExtent l="0" t="0" r="0" b="0"/>
             <wp:docPr id="24" name="Picture 24"/>
@@ -38042,7 +38013,7 @@
           <w:lang w:val="vi-VN"/>
         </w:rPr>
       </w:pPr>
-      <w:bookmarkStart w:id="152" w:name="_Toc235739114"/>
+      <w:bookmarkStart w:id="151" w:name="_Toc235739114"/>
       <w:r>
         <w:rPr>
           <w:lang w:val="vi-VN"/>
@@ -38124,7 +38095,7 @@
         </w:rPr>
         <w:t xml:space="preserve"> Giao diện sản phẩm</w:t>
       </w:r>
-      <w:bookmarkEnd w:id="152"/>
+      <w:bookmarkEnd w:id="151"/>
     </w:p>
     <w:p>
       <w:pPr>
@@ -38144,7 +38115,7 @@
           <w:lang w:val="vi-VN"/>
         </w:rPr>
         <w:drawing>
-          <wp:inline distT="0" distB="0" distL="0" distR="0" wp14:anchorId="11F3EDC5" wp14:editId="55F55410">
+          <wp:inline distT="0" distB="0" distL="0" distR="0" wp14:anchorId="5AAD3C6F" wp14:editId="42F45294">
             <wp:extent cx="5760720" cy="2868295"/>
             <wp:effectExtent l="0" t="0" r="0" b="8255"/>
             <wp:docPr id="25" name="Picture 25"/>
@@ -38316,7 +38287,7 @@
       <w:pPr>
         <w:pStyle w:val="Caption"/>
       </w:pPr>
-      <w:bookmarkStart w:id="153" w:name="_Toc235739115"/>
+      <w:bookmarkStart w:id="152" w:name="_Toc235739115"/>
       <w:r>
         <w:t xml:space="preserve">Hình </w:t>
       </w:r>
@@ -38371,7 +38342,7 @@
         </w:rPr>
         <w:t xml:space="preserve"> Giao diện Flash Sale</w:t>
       </w:r>
-      <w:bookmarkEnd w:id="153"/>
+      <w:bookmarkEnd w:id="152"/>
     </w:p>
     <w:p>
       <w:pPr>
@@ -38391,7 +38362,7 @@
           <w:lang w:val="vi-VN"/>
         </w:rPr>
         <w:drawing>
-          <wp:inline distT="0" distB="0" distL="0" distR="0" wp14:anchorId="3FA6DE2D" wp14:editId="7FA6418E">
+          <wp:inline distT="0" distB="0" distL="0" distR="0" wp14:anchorId="3210D2F4" wp14:editId="4A79B6A7">
             <wp:extent cx="5760720" cy="2836545"/>
             <wp:effectExtent l="0" t="0" r="0" b="1905"/>
             <wp:docPr id="26" name="Picture 26"/>
@@ -38450,7 +38421,7 @@
           <w:lang w:val="vi-VN"/>
         </w:rPr>
       </w:pPr>
-      <w:bookmarkStart w:id="154" w:name="_Toc235739116"/>
+      <w:bookmarkStart w:id="153" w:name="_Toc235739116"/>
       <w:r>
         <w:rPr>
           <w:lang w:val="vi-VN"/>
@@ -38531,7 +38502,7 @@
         </w:rPr>
         <w:t xml:space="preserve"> Giao diện khuyến mãi</w:t>
       </w:r>
-      <w:bookmarkEnd w:id="154"/>
+      <w:bookmarkEnd w:id="153"/>
     </w:p>
     <w:p>
       <w:pPr>
@@ -38550,7 +38521,7 @@
           <w:lang w:val="vi-VN"/>
         </w:rPr>
         <w:drawing>
-          <wp:inline distT="0" distB="0" distL="0" distR="0" wp14:anchorId="282DE34B" wp14:editId="03756DB8">
+          <wp:inline distT="0" distB="0" distL="0" distR="0" wp14:anchorId="3A61009B" wp14:editId="36610F47">
             <wp:extent cx="5760720" cy="2787015"/>
             <wp:effectExtent l="0" t="0" r="0" b="0"/>
             <wp:docPr id="27" name="Picture 27"/>
@@ -38590,7 +38561,7 @@
       <w:pPr>
         <w:pStyle w:val="Caption"/>
       </w:pPr>
-      <w:bookmarkStart w:id="155" w:name="_Toc235739117"/>
+      <w:bookmarkStart w:id="154" w:name="_Toc235739117"/>
       <w:r>
         <w:t xml:space="preserve">Hình </w:t>
       </w:r>
@@ -38645,7 +38616,7 @@
         </w:rPr>
         <w:t xml:space="preserve"> Blog giày thể thao</w:t>
       </w:r>
-      <w:bookmarkEnd w:id="155"/>
+      <w:bookmarkEnd w:id="154"/>
     </w:p>
     <w:p>
       <w:pPr>
@@ -38664,7 +38635,7 @@
           <w:lang w:val="vi-VN"/>
         </w:rPr>
         <w:drawing>
-          <wp:inline distT="0" distB="0" distL="0" distR="0" wp14:anchorId="4AFEEB88" wp14:editId="309EA962">
+          <wp:inline distT="0" distB="0" distL="0" distR="0" wp14:anchorId="4493EFE2" wp14:editId="7A6689D0">
             <wp:extent cx="5432555" cy="2318657"/>
             <wp:effectExtent l="0" t="0" r="0" b="5715"/>
             <wp:docPr id="1187846013" name="Picture 1"/>
@@ -38719,7 +38690,7 @@
       <w:pPr>
         <w:pStyle w:val="Caption"/>
       </w:pPr>
-      <w:bookmarkStart w:id="156" w:name="_Toc235739118"/>
+      <w:bookmarkStart w:id="155" w:name="_Toc235739118"/>
       <w:r>
         <w:lastRenderedPageBreak/>
         <w:t xml:space="preserve">Hình </w:t>
@@ -38775,7 +38746,7 @@
         </w:rPr>
         <w:t xml:space="preserve"> Đặt hàng</w:t>
       </w:r>
-      <w:bookmarkEnd w:id="156"/>
+      <w:bookmarkEnd w:id="155"/>
     </w:p>
     <w:p>
       <w:pPr>
@@ -38794,7 +38765,7 @@
           <w:lang w:val="vi-VN"/>
         </w:rPr>
         <w:drawing>
-          <wp:inline distT="0" distB="0" distL="0" distR="0" wp14:anchorId="51D4DA6F" wp14:editId="6DCCB940">
+          <wp:inline distT="0" distB="0" distL="0" distR="0" wp14:anchorId="4AC1F32A" wp14:editId="0D9A5CD1">
             <wp:extent cx="5760720" cy="2827655"/>
             <wp:effectExtent l="0" t="0" r="0" b="0"/>
             <wp:docPr id="28" name="Picture 28"/>
@@ -38847,7 +38818,7 @@
           <w:lang w:val="vi-VN"/>
         </w:rPr>
         <w:drawing>
-          <wp:inline distT="0" distB="0" distL="0" distR="0" wp14:anchorId="61EBBFCA" wp14:editId="2C2985D2">
+          <wp:inline distT="0" distB="0" distL="0" distR="0" wp14:anchorId="75E76722" wp14:editId="496C7FCF">
             <wp:extent cx="5760720" cy="2874010"/>
             <wp:effectExtent l="0" t="0" r="0" b="2540"/>
             <wp:docPr id="29" name="Picture 29"/>
@@ -38977,7 +38948,7 @@
           <w:lang w:val="vi-VN"/>
         </w:rPr>
       </w:pPr>
-      <w:bookmarkStart w:id="157" w:name="_Toc235739119"/>
+      <w:bookmarkStart w:id="156" w:name="_Toc235739119"/>
       <w:r>
         <w:rPr>
           <w:lang w:val="vi-VN"/>
@@ -39059,7 +39030,7 @@
         </w:rPr>
         <w:t xml:space="preserve"> Viết khiếu nại sản phẩm</w:t>
       </w:r>
-      <w:bookmarkEnd w:id="157"/>
+      <w:bookmarkEnd w:id="156"/>
     </w:p>
     <w:p>
       <w:pPr>
@@ -39078,7 +39049,7 @@
           <w:lang w:val="vi-VN"/>
         </w:rPr>
         <w:drawing>
-          <wp:inline distT="0" distB="0" distL="0" distR="0" wp14:anchorId="4FFF902C" wp14:editId="1A4ABB62">
+          <wp:inline distT="0" distB="0" distL="0" distR="0" wp14:anchorId="626FF6CC" wp14:editId="7C5BDEB3">
             <wp:extent cx="5760720" cy="2821305"/>
             <wp:effectExtent l="0" t="0" r="0" b="0"/>
             <wp:docPr id="30" name="Picture 30"/>
@@ -39163,7 +39134,7 @@
           <w:lang w:val="vi-VN"/>
         </w:rPr>
         <w:drawing>
-          <wp:inline distT="0" distB="0" distL="0" distR="0" wp14:anchorId="40035872" wp14:editId="5B64EFF2">
+          <wp:inline distT="0" distB="0" distL="0" distR="0" wp14:anchorId="6B7B7D20" wp14:editId="7B7C1774">
             <wp:extent cx="3153215" cy="4677428"/>
             <wp:effectExtent l="0" t="0" r="9525" b="8890"/>
             <wp:docPr id="32" name="Picture 32"/>
@@ -39255,7 +39226,7 @@
           <w:lang w:val="vi-VN"/>
         </w:rPr>
         <w:drawing>
-          <wp:inline distT="0" distB="0" distL="0" distR="0" wp14:anchorId="4A55EB48" wp14:editId="5D301739">
+          <wp:inline distT="0" distB="0" distL="0" distR="0" wp14:anchorId="629CAD75" wp14:editId="2FB74622">
             <wp:extent cx="3238952" cy="4658375"/>
             <wp:effectExtent l="0" t="0" r="0" b="8890"/>
             <wp:docPr id="33" name="Picture 33"/>
@@ -39302,7 +39273,7 @@
           <w:lang w:val="vi-VN"/>
         </w:rPr>
       </w:pPr>
-      <w:bookmarkStart w:id="158" w:name="_Toc235739086"/>
+      <w:bookmarkStart w:id="157" w:name="_Toc235739086"/>
       <w:r>
         <w:rPr>
           <w:rFonts w:cs="Times New Roman"/>
@@ -39311,23 +39282,23 @@
         </w:rPr>
         <w:t>Phân hệ Quản trị</w:t>
       </w:r>
+      <w:bookmarkEnd w:id="157"/>
+    </w:p>
+    <w:p>
+      <w:pPr>
+        <w:pStyle w:val="Heading3"/>
+        <w:rPr>
+          <w:lang w:val="vi-VN"/>
+        </w:rPr>
+      </w:pPr>
+      <w:bookmarkStart w:id="158" w:name="_Toc235739087"/>
+      <w:r>
+        <w:rPr>
+          <w:lang w:val="vi-VN"/>
+        </w:rPr>
+        <w:t>Nhân viên bán hàng</w:t>
+      </w:r>
       <w:bookmarkEnd w:id="158"/>
-    </w:p>
-    <w:p>
-      <w:pPr>
-        <w:pStyle w:val="Heading3"/>
-        <w:rPr>
-          <w:lang w:val="vi-VN"/>
-        </w:rPr>
-      </w:pPr>
-      <w:bookmarkStart w:id="159" w:name="_Toc235739087"/>
-      <w:r>
-        <w:rPr>
-          <w:lang w:val="vi-VN"/>
-        </w:rPr>
-        <w:t>Nhân viên bán hàng</w:t>
-      </w:r>
-      <w:bookmarkEnd w:id="159"/>
     </w:p>
     <w:p>
       <w:pPr>
@@ -39357,7 +39328,7 @@
           <w:lang w:val="vi-VN"/>
         </w:rPr>
         <w:drawing>
-          <wp:inline distT="0" distB="0" distL="0" distR="0" wp14:anchorId="18F7DF65" wp14:editId="7841D891">
+          <wp:inline distT="0" distB="0" distL="0" distR="0" wp14:anchorId="250A5E05" wp14:editId="19C5AD3A">
             <wp:extent cx="5760720" cy="2836545"/>
             <wp:effectExtent l="0" t="0" r="0" b="1905"/>
             <wp:docPr id="34" name="Picture 34"/>
@@ -39400,7 +39371,7 @@
           <w:lang w:val="vi-VN"/>
         </w:rPr>
       </w:pPr>
-      <w:bookmarkStart w:id="160" w:name="_Toc235739088"/>
+      <w:bookmarkStart w:id="159" w:name="_Toc235739088"/>
       <w:r>
         <w:rPr>
           <w:lang w:val="vi-VN"/>
@@ -39408,7 +39379,7 @@
         <w:lastRenderedPageBreak/>
         <w:t>Chủ kinh doanh</w:t>
       </w:r>
-      <w:bookmarkEnd w:id="160"/>
+      <w:bookmarkEnd w:id="159"/>
     </w:p>
     <w:p>
       <w:pPr>
@@ -39430,7 +39401,7 @@
           <w:lang w:val="vi-VN"/>
         </w:rPr>
         <w:drawing>
-          <wp:inline distT="0" distB="0" distL="0" distR="0" wp14:anchorId="111E1955" wp14:editId="4ABE7FA9">
+          <wp:inline distT="0" distB="0" distL="0" distR="0" wp14:anchorId="4F934184" wp14:editId="5F454EAD">
             <wp:extent cx="5760720" cy="2824480"/>
             <wp:effectExtent l="0" t="0" r="0" b="0"/>
             <wp:docPr id="35" name="Picture 35"/>
@@ -39489,7 +39460,7 @@
           <w:lang w:val="vi-VN"/>
         </w:rPr>
         <w:drawing>
-          <wp:inline distT="0" distB="0" distL="0" distR="0" wp14:anchorId="09344F90" wp14:editId="36DD00A2">
+          <wp:inline distT="0" distB="0" distL="0" distR="0" wp14:anchorId="00E82801" wp14:editId="65536A14">
             <wp:extent cx="5760720" cy="2857500"/>
             <wp:effectExtent l="0" t="0" r="0" b="0"/>
             <wp:docPr id="36" name="Picture 36"/>
@@ -39556,7 +39527,7 @@
           <w:lang w:val="vi-VN"/>
         </w:rPr>
         <w:drawing>
-          <wp:inline distT="0" distB="0" distL="0" distR="0" wp14:anchorId="576E1EF7" wp14:editId="36A6DAF3">
+          <wp:inline distT="0" distB="0" distL="0" distR="0" wp14:anchorId="4C19788D" wp14:editId="0832A520">
             <wp:extent cx="5760720" cy="2815590"/>
             <wp:effectExtent l="0" t="0" r="0" b="3810"/>
             <wp:docPr id="37" name="Picture 37"/>
@@ -39622,7 +39593,7 @@
           <w:lang w:val="vi-VN"/>
         </w:rPr>
         <w:drawing>
-          <wp:inline distT="0" distB="0" distL="0" distR="0" wp14:anchorId="3A2A615D" wp14:editId="06E5F266">
+          <wp:inline distT="0" distB="0" distL="0" distR="0" wp14:anchorId="19F55F52" wp14:editId="75568415">
             <wp:extent cx="5760720" cy="2851785"/>
             <wp:effectExtent l="0" t="0" r="0" b="5715"/>
             <wp:docPr id="38" name="Picture 38"/>
@@ -39689,7 +39660,7 @@
           <w:lang w:val="vi-VN"/>
         </w:rPr>
         <w:drawing>
-          <wp:inline distT="0" distB="0" distL="0" distR="0" wp14:anchorId="3E90DCB7" wp14:editId="56703205">
+          <wp:inline distT="0" distB="0" distL="0" distR="0" wp14:anchorId="13161BC8" wp14:editId="52348EC3">
             <wp:extent cx="5760720" cy="2794000"/>
             <wp:effectExtent l="0" t="0" r="0" b="6350"/>
             <wp:docPr id="39" name="Picture 39"/>
@@ -39755,7 +39726,7 @@
           <w:lang w:val="vi-VN"/>
         </w:rPr>
         <w:drawing>
-          <wp:inline distT="0" distB="0" distL="0" distR="0" wp14:anchorId="293BC5FB" wp14:editId="7526F1B1">
+          <wp:inline distT="0" distB="0" distL="0" distR="0" wp14:anchorId="4555B724" wp14:editId="045FB3ED">
             <wp:extent cx="5760720" cy="2849880"/>
             <wp:effectExtent l="0" t="0" r="0" b="7620"/>
             <wp:docPr id="40" name="Picture 40"/>
@@ -39822,7 +39793,7 @@
           <w:noProof/>
         </w:rPr>
         <w:drawing>
-          <wp:inline distT="0" distB="0" distL="0" distR="0" wp14:anchorId="72130663" wp14:editId="5EE9042A">
+          <wp:inline distT="0" distB="0" distL="0" distR="0" wp14:anchorId="66864863" wp14:editId="4893EE22">
             <wp:extent cx="5760720" cy="2816860"/>
             <wp:effectExtent l="0" t="0" r="0" b="2540"/>
             <wp:docPr id="41" name="Picture 41"/>
@@ -39888,7 +39859,7 @@
           <w:lang w:val="vi-VN"/>
         </w:rPr>
         <w:drawing>
-          <wp:inline distT="0" distB="0" distL="0" distR="0" wp14:anchorId="2C51B75F" wp14:editId="55F47181">
+          <wp:inline distT="0" distB="0" distL="0" distR="0" wp14:anchorId="6E2364F7" wp14:editId="5EE55708">
             <wp:extent cx="5760720" cy="2854325"/>
             <wp:effectExtent l="0" t="0" r="0" b="3175"/>
             <wp:docPr id="42" name="Picture 42"/>
@@ -39940,16 +39911,60 @@
     <w:p>
       <w:pPr>
         <w:rPr>
-          <w:lang w:val="vi-VN"/>
-        </w:rPr>
-      </w:pPr>
-      <w:r>
-        <w:rPr>
           <w:noProof/>
           <w:lang w:val="vi-VN"/>
         </w:rPr>
+      </w:pPr>
+      <w:r>
+        <w:rPr>
+          <w:noProof/>
+          <w:lang w:val="vi-VN"/>
+        </w:rPr>
         <w:t xml:space="preserve"> </w:t>
       </w:r>
+    </w:p>
+    <w:p>
+      <w:pPr>
+        <w:rPr>
+          <w:lang w:val="vi-VN"/>
+        </w:rPr>
+      </w:pPr>
+    </w:p>
+    <w:p>
+      <w:pPr>
+        <w:rPr>
+          <w:lang w:val="vi-VN"/>
+        </w:rPr>
+      </w:pPr>
+    </w:p>
+    <w:p>
+      <w:pPr>
+        <w:rPr>
+          <w:lang w:val="vi-VN"/>
+        </w:rPr>
+      </w:pPr>
+    </w:p>
+    <w:p>
+      <w:pPr>
+        <w:rPr>
+          <w:lang w:val="vi-VN"/>
+        </w:rPr>
+      </w:pPr>
+    </w:p>
+    <w:p>
+      <w:pPr>
+        <w:rPr>
+          <w:lang w:val="vi-VN"/>
+        </w:rPr>
+      </w:pPr>
+    </w:p>
+    <w:p>
+      <w:pPr>
+        <w:jc w:val="right"/>
+        <w:rPr>
+          <w:lang w:val="vi-VN"/>
+        </w:rPr>
+      </w:pPr>
     </w:p>
     <w:p>
       <w:pPr>
@@ -39966,7 +39981,7 @@
           <w:noProof/>
         </w:rPr>
         <w:drawing>
-          <wp:inline distT="0" distB="0" distL="0" distR="0" wp14:anchorId="1DB35255" wp14:editId="036A5303">
+          <wp:inline distT="0" distB="0" distL="0" distR="0" wp14:anchorId="1F48BF20" wp14:editId="44D8F3B5">
             <wp:extent cx="5760720" cy="2785745"/>
             <wp:effectExtent l="0" t="0" r="0" b="0"/>
             <wp:docPr id="1835972042" name="Picture 1"/>
@@ -40028,7 +40043,7 @@
           <w:lang w:val="vi-VN"/>
         </w:rPr>
         <w:drawing>
-          <wp:inline distT="0" distB="0" distL="0" distR="0" wp14:anchorId="20FF3C2F" wp14:editId="7AB4A359">
+          <wp:inline distT="0" distB="0" distL="0" distR="0" wp14:anchorId="520A52BA" wp14:editId="71147997">
             <wp:extent cx="5760720" cy="2827655"/>
             <wp:effectExtent l="0" t="0" r="0" b="0"/>
             <wp:docPr id="43" name="Picture 43"/>
@@ -40072,11 +40087,11 @@
           <w:lang w:val="vi-VN"/>
         </w:rPr>
       </w:pPr>
-      <w:bookmarkStart w:id="161" w:name="_Toc235739089"/>
+      <w:bookmarkStart w:id="160" w:name="_Toc235739089"/>
       <w:r>
         <w:t>KIỂM THỬ HỆ THỐNG</w:t>
       </w:r>
-      <w:bookmarkEnd w:id="161"/>
+      <w:bookmarkEnd w:id="160"/>
     </w:p>
     <w:p>
       <w:pPr>
@@ -40106,7 +40121,7 @@
           <w:lang w:val="vi-VN"/>
         </w:rPr>
       </w:pPr>
-      <w:bookmarkStart w:id="162" w:name="_Toc235736679"/>
+      <w:bookmarkStart w:id="161" w:name="_Toc235736679"/>
       <w:r>
         <w:rPr>
           <w:lang w:val="vi-VN"/>
@@ -40142,7 +40157,7 @@
         </w:rPr>
         <w:t xml:space="preserve"> Kết quả kiểm thử chức năng</w:t>
       </w:r>
-      <w:bookmarkEnd w:id="162"/>
+      <w:bookmarkEnd w:id="161"/>
     </w:p>
     <w:tbl>
       <w:tblPr>
@@ -42307,48 +42322,48 @@
           <w:lang w:val="vi-VN"/>
         </w:rPr>
       </w:pPr>
-      <w:bookmarkStart w:id="163" w:name="_Toc235739090"/>
+      <w:bookmarkStart w:id="162" w:name="_Toc235739090"/>
       <w:r>
         <w:t>Kiểm thử API</w:t>
       </w:r>
+      <w:bookmarkEnd w:id="162"/>
+    </w:p>
+    <w:p>
+      <w:pPr>
+        <w:pStyle w:val="Caption"/>
+      </w:pPr>
+      <w:bookmarkStart w:id="163" w:name="_Toc235736680"/>
+      <w:r>
+        <w:t xml:space="preserve">Table </w:t>
+      </w:r>
+      <w:r>
+        <w:fldChar w:fldCharType="begin"/>
+      </w:r>
+      <w:r>
+        <w:instrText xml:space="preserve"> SEQ Table \* ARABIC </w:instrText>
+      </w:r>
+      <w:r>
+        <w:fldChar w:fldCharType="separate"/>
+      </w:r>
+      <w:r>
+        <w:rPr>
+          <w:noProof/>
+        </w:rPr>
+        <w:t>6</w:t>
+      </w:r>
+      <w:r>
+        <w:rPr>
+          <w:noProof/>
+        </w:rPr>
+        <w:fldChar w:fldCharType="end"/>
+      </w:r>
+      <w:r>
+        <w:rPr>
+          <w:lang w:val="vi-VN"/>
+        </w:rPr>
+        <w:t xml:space="preserve"> Kiểm thử API</w:t>
+      </w:r>
       <w:bookmarkEnd w:id="163"/>
-    </w:p>
-    <w:p>
-      <w:pPr>
-        <w:pStyle w:val="Caption"/>
-      </w:pPr>
-      <w:bookmarkStart w:id="164" w:name="_Toc235736680"/>
-      <w:r>
-        <w:t xml:space="preserve">Table </w:t>
-      </w:r>
-      <w:r>
-        <w:fldChar w:fldCharType="begin"/>
-      </w:r>
-      <w:r>
-        <w:instrText xml:space="preserve"> SEQ Table \* ARABIC </w:instrText>
-      </w:r>
-      <w:r>
-        <w:fldChar w:fldCharType="separate"/>
-      </w:r>
-      <w:r>
-        <w:rPr>
-          <w:noProof/>
-        </w:rPr>
-        <w:t>6</w:t>
-      </w:r>
-      <w:r>
-        <w:rPr>
-          <w:noProof/>
-        </w:rPr>
-        <w:fldChar w:fldCharType="end"/>
-      </w:r>
-      <w:r>
-        <w:rPr>
-          <w:lang w:val="vi-VN"/>
-        </w:rPr>
-        <w:t xml:space="preserve"> Kiểm thử API</w:t>
-      </w:r>
-      <w:bookmarkEnd w:id="164"/>
     </w:p>
     <w:tbl>
       <w:tblPr>
@@ -42877,57 +42892,57 @@
           <w:lang w:val="vi-VN"/>
         </w:rPr>
       </w:pPr>
-      <w:bookmarkStart w:id="165" w:name="_Toc235739091"/>
+      <w:bookmarkStart w:id="164" w:name="_Toc235739091"/>
       <w:r>
         <w:rPr>
           <w:lang w:val="vi-VN"/>
         </w:rPr>
         <w:t>Kiểm thử phân quyền</w:t>
       </w:r>
+      <w:bookmarkEnd w:id="164"/>
+      <w:r>
+        <w:rPr>
+          <w:lang w:val="vi-VN"/>
+        </w:rPr>
+        <w:t xml:space="preserve"> </w:t>
+      </w:r>
+    </w:p>
+    <w:p>
+      <w:pPr>
+        <w:pStyle w:val="Caption"/>
+      </w:pPr>
+      <w:bookmarkStart w:id="165" w:name="_Toc235736681"/>
+      <w:r>
+        <w:t xml:space="preserve">Table </w:t>
+      </w:r>
+      <w:r>
+        <w:fldChar w:fldCharType="begin"/>
+      </w:r>
+      <w:r>
+        <w:instrText xml:space="preserve"> SEQ Table \* ARABIC </w:instrText>
+      </w:r>
+      <w:r>
+        <w:fldChar w:fldCharType="separate"/>
+      </w:r>
+      <w:r>
+        <w:rPr>
+          <w:noProof/>
+        </w:rPr>
+        <w:t>7</w:t>
+      </w:r>
+      <w:r>
+        <w:rPr>
+          <w:noProof/>
+        </w:rPr>
+        <w:fldChar w:fldCharType="end"/>
+      </w:r>
+      <w:r>
+        <w:rPr>
+          <w:lang w:val="vi-VN"/>
+        </w:rPr>
+        <w:t xml:space="preserve"> Kiểm thử phân quyền</w:t>
+      </w:r>
       <w:bookmarkEnd w:id="165"/>
-      <w:r>
-        <w:rPr>
-          <w:lang w:val="vi-VN"/>
-        </w:rPr>
-        <w:t xml:space="preserve"> </w:t>
-      </w:r>
-    </w:p>
-    <w:p>
-      <w:pPr>
-        <w:pStyle w:val="Caption"/>
-      </w:pPr>
-      <w:bookmarkStart w:id="166" w:name="_Toc235736681"/>
-      <w:r>
-        <w:t xml:space="preserve">Table </w:t>
-      </w:r>
-      <w:r>
-        <w:fldChar w:fldCharType="begin"/>
-      </w:r>
-      <w:r>
-        <w:instrText xml:space="preserve"> SEQ Table \* ARABIC </w:instrText>
-      </w:r>
-      <w:r>
-        <w:fldChar w:fldCharType="separate"/>
-      </w:r>
-      <w:r>
-        <w:rPr>
-          <w:noProof/>
-        </w:rPr>
-        <w:t>7</w:t>
-      </w:r>
-      <w:r>
-        <w:rPr>
-          <w:noProof/>
-        </w:rPr>
-        <w:fldChar w:fldCharType="end"/>
-      </w:r>
-      <w:r>
-        <w:rPr>
-          <w:lang w:val="vi-VN"/>
-        </w:rPr>
-        <w:t xml:space="preserve"> Kiểm thử phân quyền</w:t>
-      </w:r>
-      <w:bookmarkEnd w:id="166"/>
     </w:p>
     <w:tbl>
       <w:tblPr>
@@ -43203,11 +43218,11 @@
           <w:lang w:val="vi-VN"/>
         </w:rPr>
       </w:pPr>
-      <w:bookmarkStart w:id="167" w:name="_Toc235739092"/>
+      <w:bookmarkStart w:id="166" w:name="_Toc235739092"/>
       <w:r>
         <w:t>Kiểm thử hiệu năng</w:t>
       </w:r>
-      <w:bookmarkEnd w:id="167"/>
+      <w:bookmarkEnd w:id="166"/>
     </w:p>
     <w:p>
       <w:pPr>
@@ -43309,9 +43324,6 @@
         </w:rPr>
       </w:pPr>
       <w:r>
-        <w:rPr>
-          <w:rFonts w:ascii="Times New Roman" w:hAnsi="Times New Roman"/>
-        </w:rPr>
         <w:t xml:space="preserve">Cơ chế chat thời gian thực bằng HTTP Polling hoạt động ổn định, độ trễ cập nhật tin nhắn khoảng 2 giây. </w:t>
       </w:r>
     </w:p>
@@ -43370,14 +43382,14 @@
           <w:lang w:val="vi-VN"/>
         </w:rPr>
       </w:pPr>
-      <w:bookmarkStart w:id="168" w:name="_Toc235739093"/>
+      <w:bookmarkStart w:id="167" w:name="_Toc235739093"/>
       <w:r>
         <w:rPr>
           <w:lang w:val="vi-VN"/>
         </w:rPr>
         <w:t>Đánh giá kết quả kiểm thử</w:t>
       </w:r>
-      <w:bookmarkEnd w:id="168"/>
+      <w:bookmarkEnd w:id="167"/>
     </w:p>
     <w:p>
       <w:pPr>
@@ -43409,9 +43421,7 @@
         </w:rPr>
       </w:pPr>
       <w:r>
-        <w:rPr>
-          <w:rFonts w:ascii="Times New Roman" w:hAnsi="Times New Roman"/>
-        </w:rPr>
+        <w:lastRenderedPageBreak/>
         <w:t>Bên cạnh đó, các chức năng nâng cao như chatbot AI, chat thời gian thực bằng cơ chế HTTP Polling và thanh toán trực tuyến thông qua VNPay, MoMo, COD đều được tích hợp thành công, góp phần nâng cao tính thực tiễn của hệ thống.</w:t>
       </w:r>
     </w:p>
@@ -43431,7 +43441,6 @@
           <w:szCs w:val="26"/>
           <w:lang w:val="vi-VN" w:eastAsia="ja-JP"/>
         </w:rPr>
-        <w:lastRenderedPageBreak/>
         <w:t>Tổng hợp kết quả kiểm thử cho thấy hệ thống đáp ứng đầy đủ các yêu cầu chức năng của đề tài và có thể triển khai thử nghiệm trong môi trường thực tế với quy mô cửa hàng giày thể thao vừa và nhỏ.</w:t>
       </w:r>
     </w:p>
@@ -43567,14 +43576,14 @@
           <w:lang w:val="vi-VN"/>
         </w:rPr>
       </w:pPr>
-      <w:bookmarkStart w:id="169" w:name="_Toc235739094"/>
+      <w:bookmarkStart w:id="168" w:name="_Toc235739094"/>
       <w:r>
         <w:rPr>
           <w:lang w:val="vi-VN"/>
         </w:rPr>
         <w:t>KIẾN NGHỊ VÀ KẾT LUẬN</w:t>
       </w:r>
-      <w:bookmarkEnd w:id="169"/>
+      <w:bookmarkEnd w:id="168"/>
     </w:p>
     <w:p>
       <w:pPr>
@@ -43585,13 +43594,13 @@
           <w:sz w:val="26"/>
         </w:rPr>
       </w:pPr>
-      <w:bookmarkStart w:id="170" w:name="_Toc168348809"/>
-      <w:bookmarkStart w:id="171" w:name="_Toc168434761"/>
-      <w:bookmarkStart w:id="172" w:name="_Toc168438271"/>
-      <w:bookmarkStart w:id="173" w:name="_Toc168438404"/>
-      <w:bookmarkStart w:id="174" w:name="_Toc168439005"/>
-      <w:bookmarkStart w:id="175" w:name="_Toc215604364"/>
-      <w:bookmarkStart w:id="176" w:name="_Toc235739095"/>
+      <w:bookmarkStart w:id="169" w:name="_Toc168348809"/>
+      <w:bookmarkStart w:id="170" w:name="_Toc168434761"/>
+      <w:bookmarkStart w:id="171" w:name="_Toc168438271"/>
+      <w:bookmarkStart w:id="172" w:name="_Toc168438404"/>
+      <w:bookmarkStart w:id="173" w:name="_Toc168439005"/>
+      <w:bookmarkStart w:id="174" w:name="_Toc215604364"/>
+      <w:bookmarkStart w:id="175" w:name="_Toc235739095"/>
       <w:r>
         <w:rPr>
           <w:rFonts w:eastAsia="TimesNewRomanPS-ItalicMT" w:cstheme="majorHAnsi"/>
@@ -43599,13 +43608,13 @@
         </w:rPr>
         <w:t>Kết quả đạt được</w:t>
       </w:r>
+      <w:bookmarkEnd w:id="169"/>
       <w:bookmarkEnd w:id="170"/>
       <w:bookmarkEnd w:id="171"/>
       <w:bookmarkEnd w:id="172"/>
       <w:bookmarkEnd w:id="173"/>
       <w:bookmarkEnd w:id="174"/>
       <w:bookmarkEnd w:id="175"/>
-      <w:bookmarkEnd w:id="176"/>
     </w:p>
     <w:p>
       <w:pPr>
@@ -43630,9 +43639,6 @@
         </w:rPr>
       </w:pPr>
       <w:r>
-        <w:rPr>
-          <w:rFonts w:ascii="Times New Roman" w:hAnsi="Times New Roman"/>
-        </w:rPr>
         <w:t xml:space="preserve">-  Về mặt kiến thức chuyên môn: Nắm vững cơ sở lý thuyết và vận dụng hiệu quả các công nghệ phát triển ứng dụng web hiện đại, bao gồm ReactJS trong xây dựng giao diện người dùng (Frontend), Node.js trong phát triển hệ thống phía máy chủ (Backend), hệ quản trị cơ sở dữ liệu MongoDB và cơ chế truyền thông HTTP Short Polling để truy xuất tin nhắn thời gian thực. </w:t>
       </w:r>
     </w:p>
@@ -43699,6 +43705,7 @@
         <w:rPr>
           <w:lang w:val="vi-VN"/>
         </w:rPr>
+        <w:lastRenderedPageBreak/>
         <w:t>Về mặt kỹ năng làm việc:</w:t>
       </w:r>
       <w:r>
@@ -43723,15 +43730,14 @@
           <w:lang w:val="vi-VN"/>
         </w:rPr>
       </w:pPr>
-      <w:bookmarkStart w:id="177" w:name="_Toc235739096"/>
-      <w:r>
-        <w:rPr>
-          <w:lang w:val="vi-VN"/>
-        </w:rPr>
-        <w:lastRenderedPageBreak/>
+      <w:bookmarkStart w:id="176" w:name="_Toc235739096"/>
+      <w:r>
+        <w:rPr>
+          <w:lang w:val="vi-VN"/>
+        </w:rPr>
         <w:t>Kiến nghị và giải pháp phát triển hệ thống</w:t>
       </w:r>
-      <w:bookmarkEnd w:id="177"/>
+      <w:bookmarkEnd w:id="176"/>
     </w:p>
     <w:p>
       <w:pPr>
@@ -43981,8 +43987,8 @@
           <w:lang w:val="vi-VN"/>
         </w:rPr>
       </w:pPr>
-      <w:bookmarkStart w:id="178" w:name="_Toc235631464"/>
-      <w:bookmarkStart w:id="179" w:name="_Toc235739097"/>
+      <w:bookmarkStart w:id="177" w:name="_Toc235631464"/>
+      <w:bookmarkStart w:id="178" w:name="_Toc235739097"/>
       <w:r>
         <w:rPr>
           <w:lang w:val="vi-VN"/>
@@ -43990,8 +43996,8 @@
         <w:lastRenderedPageBreak/>
         <w:t>TÀI LIỆU THAM KHẢO</w:t>
       </w:r>
+      <w:bookmarkEnd w:id="177"/>
       <w:bookmarkEnd w:id="178"/>
-      <w:bookmarkEnd w:id="179"/>
     </w:p>
     <w:p>
       <w:pPr>

</xml_diff>